<commit_message>
Expand A2_2 deck; review and fix PMM code; reuse unchanged Mplus fits in A3
- A2_2: reorganized slides (one QMD per slide) with core and PMM steps,
  factor model, loadings, factor means, probability histogram, margins,
  pairwise kappas, limitations, next steps, summary, and back-up slides
  (ADL/IADL, probabilities vs. most likely class, cut points, Hudomiet,
  Langa-Weir, consensus, PMM overview). PMM shown both as the mean of class
  probabilities and as the most likely class. Driver opens the deck in the
  browser after rendering.
- A3: Mplus fits reused when syntax and data are unchanged
  (PMM_091_mplus_run_cache.R); shared probability helpers
  (PMM_109_probability_tools.R); PMM code review with diagnostics in
  Reports/ and tools/.
- Retire the MCI ceiling script to the archive.
- Update A3_2, A2 manuscript, and Slides2603 for the above; refresh the
  README and session logs.
- Render 2026-10-23 A2_2 slides.

Co-authored-by: Copilot <223556219+Copilot@users.noreply.github.com>
</commit_message>
<xml_diff>
--- a/Reports/MS_Main_2026-10-22.docx
+++ b/Reports/MS_Main_2026-10-22.docx
@@ -360,7 +360,7 @@
       </w:pPr>
       <w:r>
         <w:rPr/>
-        <w:t>PMM versus Manly-Jones algorithm: 0.302</w:t>
+        <w:t>PMM versus Manly-Jones algorithm: 0.308</w:t>
       </w:r>
     </w:p>
     <w:p>
@@ -402,7 +402,7 @@
       </w:pPr>
       <w:r>
         <w:rPr/>
-        <w:t>PMM versus Manly-Jones algorithm: 0.37</w:t>
+        <w:t>PMM versus Manly-Jones algorithm: 0.373</w:t>
       </w:r>
     </w:p>
     <w:p>
@@ -1393,7 +1393,21 @@
       </w:pPr>
       <w:r>
         <w:rPr/>
-        <w:t>Class-specific test intercepts and thresholds: 10-fold cross-validation; higher kappa, lower log score; not adopted</w:t>
+        <w:t>Class-specific test intercepts and thresholds: exploratory cross-validation; not adopted</w:t>
+      </w:r>
+    </w:p>
+    <w:p>
+      <w:pPr>
+        <w:pStyle w:val="Compact"/>
+        <w:numPr>
+          <w:ilvl w:val="2"/>
+          <w:numId w:val="1"/>
+        </w:numPr>
+        <w:rPr/>
+      </w:pPr>
+      <w:r>
+        <w:rPr/>
+        <w:t>Archived comparison includes a flagged fit; no claim that the alternative is ruled out</w:t>
       </w:r>
     </w:p>
     <w:p>
@@ -1533,7 +1547,21 @@
       </w:pPr>
       <w:r>
         <w:rPr/>
-        <w:t>Probabilistic Normal/MCI/Dementia membership; replicated probability-weighted comparisons</w:t>
+        <w:t>Probabilistic Normal/MCI/Dementia membership; direct probability-weighted cross-tables</w:t>
+      </w:r>
+    </w:p>
+    <w:p>
+      <w:pPr>
+        <w:pStyle w:val="Compact"/>
+        <w:numPr>
+          <w:ilvl w:val="1"/>
+          <w:numId w:val="1"/>
+        </w:numPr>
+        <w:rPr/>
+      </w:pPr>
+      <w:r>
+        <w:rPr/>
+        <w:t>Modal-class agreement reported separately; full precision retained through computation</w:t>
       </w:r>
     </w:p>
     <w:p>
@@ -1742,6 +1770,34 @@
       <w:pPr>
         <w:pStyle w:val="Compact"/>
         <w:numPr>
+          <w:ilvl w:val="2"/>
+          <w:numId w:val="1"/>
+        </w:numPr>
+        <w:rPr/>
+      </w:pPr>
+      <w:r>
+        <w:rPr/>
+        <w:t>Common participants and HCAP16WGTR denominator for core assignments, PMM probability averages, PMM modal assignments</w:t>
+      </w:r>
+    </w:p>
+    <w:p>
+      <w:pPr>
+        <w:pStyle w:val="Compact"/>
+        <w:numPr>
+          <w:ilvl w:val="2"/>
+          <w:numId w:val="1"/>
+        </w:numPr>
+        <w:rPr/>
+      </w:pPr>
+      <w:r>
+        <w:rPr/>
+        <w:t>Percentage-point differences from Manly-Jones rates; descriptive comparison (Table 2b)</w:t>
+      </w:r>
+    </w:p>
+    <w:p>
+      <w:pPr>
+        <w:pStyle w:val="Compact"/>
+        <w:numPr>
           <w:ilvl w:val="1"/>
           <w:numId w:val="1"/>
         </w:numPr>
@@ -1899,7 +1955,35 @@
       </w:pPr>
       <w:r>
         <w:rPr/>
-        <w:t>PMM: Normal 85.5%, MCI 8.6%, Dementia 5.8%</w:t>
+        <w:t>PMM, most likely class: Normal 85.6%, MCI 8.4%, Dementia 6.0%</w:t>
+      </w:r>
+    </w:p>
+    <w:p>
+      <w:pPr>
+        <w:pStyle w:val="Compact"/>
+        <w:numPr>
+          <w:ilvl w:val="2"/>
+          <w:numId w:val="1"/>
+        </w:numPr>
+        <w:rPr/>
+      </w:pPr>
+      <w:r>
+        <w:rPr/>
+        <w:t>PMM, direct probability allocation: Normal 69.7%, MCI 21.2%, Dementia 9.1%</w:t>
+      </w:r>
+    </w:p>
+    <w:p>
+      <w:pPr>
+        <w:pStyle w:val="Compact"/>
+        <w:numPr>
+          <w:ilvl w:val="0"/>
+          <w:numId w:val="1"/>
+        </w:numPr>
+        <w:rPr/>
+      </w:pPr>
+      <w:r>
+        <w:rPr/>
+        <w:t>Table 2b: marginal-rate reproduction in the common comparison sample</w:t>
       </w:r>
     </w:p>
     <w:p>
@@ -1913,6 +1997,104 @@
       </w:pPr>
       <w:r>
         <w:rPr/>
+        <w:t>Core algorithm assignments; averaged PMM probabilities; modal PMM assignments</w:t>
+      </w:r>
+    </w:p>
+    <w:p>
+      <w:pPr>
+        <w:pStyle w:val="Compact"/>
+        <w:numPr>
+          <w:ilvl w:val="1"/>
+          <w:numId w:val="1"/>
+        </w:numPr>
+        <w:rPr/>
+      </w:pPr>
+      <w:r>
+        <w:rPr/>
+        <w:t>Differences from Manly-Jones rates, percentage points</w:t>
+      </w:r>
+    </w:p>
+    <w:p>
+      <w:pPr>
+        <w:pStyle w:val="Compact"/>
+        <w:numPr>
+          <w:ilvl w:val="1"/>
+          <w:numId w:val="1"/>
+        </w:numPr>
+        <w:rPr/>
+      </w:pPr>
+      <w:r>
+        <w:rPr/>
+        <w:t>PMM probability averages: Normal 69.7%, MCI 21.2%, Dementia 9.1%</w:t>
+      </w:r>
+    </w:p>
+    <w:p>
+      <w:pPr>
+        <w:pStyle w:val="Compact"/>
+        <w:numPr>
+          <w:ilvl w:val="1"/>
+          <w:numId w:val="1"/>
+        </w:numPr>
+        <w:rPr/>
+      </w:pPr>
+      <w:r>
+        <w:rPr/>
+        <w:t>Core algorithm differences: Normal -0.51, MCI +0.58, Dementia -0.07 percentage points</w:t>
+      </w:r>
+    </w:p>
+    <w:p>
+      <w:pPr>
+        <w:pStyle w:val="Compact"/>
+        <w:numPr>
+          <w:ilvl w:val="1"/>
+          <w:numId w:val="1"/>
+        </w:numPr>
+        <w:rPr/>
+      </w:pPr>
+      <w:r>
+        <w:rPr/>
+        <w:t>PMM probability-average differences: Normal +0.30, MCI -0.19, Dementia -0.11 percentage points</w:t>
+      </w:r>
+    </w:p>
+    <w:p>
+      <w:pPr>
+        <w:pStyle w:val="Compact"/>
+        <w:numPr>
+          <w:ilvl w:val="1"/>
+          <w:numId w:val="1"/>
+        </w:numPr>
+        <w:rPr/>
+      </w:pPr>
+      <w:r>
+        <w:rPr/>
+        <w:t>Descriptive calibration; overall margins alone insufficient for subgroup calibration</w:t>
+      </w:r>
+    </w:p>
+    <w:p>
+      <w:pPr>
+        <w:pStyle w:val="Compact"/>
+        <w:numPr>
+          <w:ilvl w:val="1"/>
+          <w:numId w:val="1"/>
+        </w:numPr>
+        <w:rPr/>
+      </w:pPr>
+      <w:r>
+        <w:rPr/>
+        <w:t>[Provenance: R/MS_MAIN/MS_010_results_objects.R; Table 2b]</w:t>
+      </w:r>
+    </w:p>
+    <w:p>
+      <w:pPr>
+        <w:pStyle w:val="Compact"/>
+        <w:numPr>
+          <w:ilvl w:val="1"/>
+          <w:numId w:val="1"/>
+        </w:numPr>
+        <w:rPr/>
+      </w:pPr>
+      <w:r>
+        <w:rPr/>
         <w:t>[Provenance: R/MS_MAIN/MS_010_results_objects.R]</w:t>
       </w:r>
     </w:p>
@@ -1983,7 +2165,7 @@
       </w:pPr>
       <w:r>
         <w:rPr/>
-        <w:t>Largest MCI probability 0.51; 2 of 3,283 above 0.50 (cognition model)</w:t>
+        <w:t>Probability separation; uncertainty near class boundaries</w:t>
       </w:r>
     </w:p>
     <w:p>
@@ -1997,7 +2179,33 @@
       </w:pPr>
       <w:r>
         <w:rPr/>
-        <w:t>Ceiling from GCP class distributions and priors: 0.60 (GCP known); 0.46 (within-class omega 0.50)</w:t>
+        <w:t>[Provenance: R/PMM_112_Margins.R]</w:t>
+      </w:r>
+      <w:bookmarkEnd w:id="9"/>
+    </w:p>
+    <w:p>
+      <w:pPr>
+        <w:pStyle w:val="Heading3"/>
+        <w:rPr/>
+      </w:pPr>
+      <w:bookmarkStart w:id="10" w:name="agreement-with-manly-jones-algorithm"/>
+      <w:r>
+        <w:rPr/>
+        <w:t>Agreement with Manly-Jones algorithm</w:t>
+      </w:r>
+    </w:p>
+    <w:p>
+      <w:pPr>
+        <w:pStyle w:val="Compact"/>
+        <w:numPr>
+          <w:ilvl w:val="0"/>
+          <w:numId w:val="1"/>
+        </w:numPr>
+        <w:rPr/>
+      </w:pPr>
+      <w:r>
+        <w:rPr/>
+        <w:t>Core algorithm versus Manly-Jones algorithm: 3-class kappa 0.501; binary kappa 0.337</w:t>
       </w:r>
     </w:p>
     <w:p>
@@ -2011,7 +2219,21 @@
       </w:pPr>
       <w:r>
         <w:rPr/>
-        <w:t>Most likely class MCI: 313; mean MCI probability 0.46</w:t>
+        <w:t>[Provenance: R_objects/A7_100_hcap_tables.rds]</w:t>
+      </w:r>
+    </w:p>
+    <w:p>
+      <w:pPr>
+        <w:pStyle w:val="Compact"/>
+        <w:numPr>
+          <w:ilvl w:val="0"/>
+          <w:numId w:val="1"/>
+        </w:numPr>
+        <w:rPr/>
+      </w:pPr>
+      <w:r>
+        <w:rPr/>
+        <w:t>PMM versus Manly-Jones algorithm: 3-class kappa 0.373; binary kappa 0.308</w:t>
       </w:r>
     </w:p>
     <w:p>
@@ -2025,7 +2247,21 @@
       </w:pPr>
       <w:r>
         <w:rPr/>
-        <w:t>[Provenance: R/PMM_114_mci_ceiling.R]</w:t>
+        <w:t>[Provenance: R/PMM_110_Comparison_of_Consensus_Langa_Weir.R]</w:t>
+      </w:r>
+    </w:p>
+    <w:p>
+      <w:pPr>
+        <w:pStyle w:val="Compact"/>
+        <w:numPr>
+          <w:ilvl w:val="0"/>
+          <w:numId w:val="1"/>
+        </w:numPr>
+        <w:rPr/>
+      </w:pPr>
+      <w:r>
+        <w:rPr/>
+        <w:t>Table 3: pairwise agreement, comparators, weight definitions</w:t>
       </w:r>
     </w:p>
     <w:p>
@@ -2039,7 +2275,33 @@
       </w:pPr>
       <w:r>
         <w:rPr/>
-        <w:t>Probability separation; uncertainty near class boundaries</w:t>
+        <w:t>[Provenance: R/MS_MAIN/MS_010_results_objects.R]</w:t>
+      </w:r>
+      <w:bookmarkEnd w:id="10"/>
+    </w:p>
+    <w:p>
+      <w:pPr>
+        <w:pStyle w:val="Heading3"/>
+        <w:rPr/>
+      </w:pPr>
+      <w:bookmarkStart w:id="11" w:name="X6d65fe6e4680f26c2a7949e29ea6de33d0c0f19"/>
+      <w:r>
+        <w:rPr/>
+        <w:t>Agreement with consensus and established HRS classifications</w:t>
+      </w:r>
+    </w:p>
+    <w:p>
+      <w:pPr>
+        <w:pStyle w:val="Compact"/>
+        <w:numPr>
+          <w:ilvl w:val="0"/>
+          <w:numId w:val="1"/>
+        </w:numPr>
+        <w:rPr/>
+      </w:pPr>
+      <w:r>
+        <w:rPr/>
+        <w:t>Core algorithm, PMM, Langa-Weir, Hudomiet</w:t>
       </w:r>
     </w:p>
     <w:p>
@@ -2053,19 +2315,35 @@
       </w:pPr>
       <w:r>
         <w:rPr/>
-        <w:t>[Provenance: R/PMM_112_Margins.R]</w:t>
-      </w:r>
-      <w:bookmarkEnd w:id="9"/>
-    </w:p>
-    <w:p>
-      <w:pPr>
-        <w:pStyle w:val="Heading3"/>
-        <w:rPr/>
-      </w:pPr>
-      <w:bookmarkStart w:id="10" w:name="agreement-with-manly-jones-algorithm"/>
-      <w:r>
-        <w:rPr/>
-        <w:t>Agreement with Manly-Jones algorithm</w:t>
+        <w:t>Separate HCAP population and consensus-subsample estimands</w:t>
+      </w:r>
+    </w:p>
+    <w:p>
+      <w:pPr>
+        <w:pStyle w:val="Compact"/>
+        <w:numPr>
+          <w:ilvl w:val="1"/>
+          <w:numId w:val="1"/>
+        </w:numPr>
+        <w:rPr/>
+      </w:pPr>
+      <w:r>
+        <w:rPr/>
+        <w:t>Weight-dependent interpretation</w:t>
+      </w:r>
+    </w:p>
+    <w:p>
+      <w:pPr>
+        <w:pStyle w:val="Compact"/>
+        <w:numPr>
+          <w:ilvl w:val="1"/>
+          <w:numId w:val="1"/>
+        </w:numPr>
+        <w:rPr/>
+      </w:pPr>
+      <w:r>
+        <w:rPr/>
+        <w:t>[Provenance: R/MS_MAIN/MS_010_results_objects.R]</w:t>
       </w:r>
     </w:p>
     <w:p>
@@ -2079,7 +2357,7 @@
       </w:pPr>
       <w:r>
         <w:rPr/>
-        <w:t>Core algorithm versus Manly-Jones algorithm: 3-class kappa 0.501; binary kappa 0.337</w:t>
+        <w:t>Table 4: pairwise three-class agreement matrix, including PMM direct probability allocation</w:t>
       </w:r>
     </w:p>
     <w:p>
@@ -2093,21 +2371,7 @@
       </w:pPr>
       <w:r>
         <w:rPr/>
-        <w:t>[Provenance: R_objects/A7_100_hcap_tables.rds]</w:t>
-      </w:r>
-    </w:p>
-    <w:p>
-      <w:pPr>
-        <w:pStyle w:val="Compact"/>
-        <w:numPr>
-          <w:ilvl w:val="0"/>
-          <w:numId w:val="1"/>
-        </w:numPr>
-        <w:rPr/>
-      </w:pPr>
-      <w:r>
-        <w:rPr/>
-        <w:t>PMM versus Manly-Jones algorithm: 3-class kappa 0.37; binary kappa 0.302</w:t>
+        <w:t>PMM versus core algorithm, Manly-Jones, consensus, Langa-Weir, and Hudomiet</w:t>
       </w:r>
     </w:p>
     <w:p>
@@ -2121,131 +2385,7 @@
       </w:pPr>
       <w:r>
         <w:rPr/>
-        <w:t>[Provenance: R/PMM_110_Comparison_of_Consensus_Langa_Weir.R]</w:t>
-      </w:r>
-    </w:p>
-    <w:p>
-      <w:pPr>
-        <w:pStyle w:val="Compact"/>
-        <w:numPr>
-          <w:ilvl w:val="0"/>
-          <w:numId w:val="1"/>
-        </w:numPr>
-        <w:rPr/>
-      </w:pPr>
-      <w:r>
-        <w:rPr/>
-        <w:t>Table 3: pairwise agreement, comparators, weight definitions</w:t>
-      </w:r>
-    </w:p>
-    <w:p>
-      <w:pPr>
-        <w:pStyle w:val="Compact"/>
-        <w:numPr>
-          <w:ilvl w:val="1"/>
-          <w:numId w:val="1"/>
-        </w:numPr>
-        <w:rPr/>
-      </w:pPr>
-      <w:r>
-        <w:rPr/>
-        <w:t>[Provenance: R/MS_MAIN/MS_010_results_objects.R]</w:t>
-      </w:r>
-      <w:bookmarkEnd w:id="10"/>
-    </w:p>
-    <w:p>
-      <w:pPr>
-        <w:pStyle w:val="Heading3"/>
-        <w:rPr/>
-      </w:pPr>
-      <w:bookmarkStart w:id="11" w:name="X6d65fe6e4680f26c2a7949e29ea6de33d0c0f19"/>
-      <w:r>
-        <w:rPr/>
-        <w:t>Agreement with consensus and established HRS classifications</w:t>
-      </w:r>
-    </w:p>
-    <w:p>
-      <w:pPr>
-        <w:pStyle w:val="Compact"/>
-        <w:numPr>
-          <w:ilvl w:val="0"/>
-          <w:numId w:val="1"/>
-        </w:numPr>
-        <w:rPr/>
-      </w:pPr>
-      <w:r>
-        <w:rPr/>
-        <w:t>Core algorithm, PMM, Langa-Weir, Hudomiet</w:t>
-      </w:r>
-    </w:p>
-    <w:p>
-      <w:pPr>
-        <w:pStyle w:val="Compact"/>
-        <w:numPr>
-          <w:ilvl w:val="1"/>
-          <w:numId w:val="1"/>
-        </w:numPr>
-        <w:rPr/>
-      </w:pPr>
-      <w:r>
-        <w:rPr/>
-        <w:t>Separate HCAP population and consensus-subsample estimands</w:t>
-      </w:r>
-    </w:p>
-    <w:p>
-      <w:pPr>
-        <w:pStyle w:val="Compact"/>
-        <w:numPr>
-          <w:ilvl w:val="1"/>
-          <w:numId w:val="1"/>
-        </w:numPr>
-        <w:rPr/>
-      </w:pPr>
-      <w:r>
-        <w:rPr/>
-        <w:t>Weight-dependent interpretation</w:t>
-      </w:r>
-    </w:p>
-    <w:p>
-      <w:pPr>
-        <w:pStyle w:val="Compact"/>
-        <w:numPr>
-          <w:ilvl w:val="1"/>
-          <w:numId w:val="1"/>
-        </w:numPr>
-        <w:rPr/>
-      </w:pPr>
-      <w:r>
-        <w:rPr/>
-        <w:t>[Provenance: R/MS_MAIN/MS_010_results_objects.R]</w:t>
-      </w:r>
-    </w:p>
-    <w:p>
-      <w:pPr>
-        <w:pStyle w:val="Compact"/>
-        <w:numPr>
-          <w:ilvl w:val="0"/>
-          <w:numId w:val="1"/>
-        </w:numPr>
-        <w:rPr/>
-      </w:pPr>
-      <w:r>
-        <w:rPr/>
-        <w:t>Table 4: A7 pairwise three-class agreement matrix</w:t>
-      </w:r>
-    </w:p>
-    <w:p>
-      <w:pPr>
-        <w:pStyle w:val="Compact"/>
-        <w:numPr>
-          <w:ilvl w:val="1"/>
-          <w:numId w:val="1"/>
-        </w:numPr>
-        <w:rPr/>
-      </w:pPr>
-      <w:r>
-        <w:rPr/>
-        <w:t>[Provenance: R_objects/A7_100_hcap_tables.rds]</w:t>
+        <w:t>[Provenance: R_objects/A7_100_hcap_tables.rds; R/MS_MAIN/MS_010_results_objects.R; current A3 probabilities]</w:t>
       </w:r>
       <w:bookmarkEnd w:id="8"/>
       <w:bookmarkEnd w:id="11"/>
@@ -2482,7 +2622,7 @@
       </w:pPr>
       <w:r>
         <w:rPr/>
-        <w:t>MCI: Core battery, 1 dimension measured with error, no informant report for tested respondents; PMM MCI probabilities rarely above 0.50 (Results, Figure 2)</w:t>
+        <w:t>Marginal-rate reproduction: probability averages and assigned classes; separate targets (Table 2b)</w:t>
       </w:r>
     </w:p>
     <w:p>
@@ -2492,12 +2632,40 @@
           <w:ilvl w:val="1"/>
           <w:numId w:val="1"/>
         </w:numPr>
+        <w:rPr/>
+      </w:pPr>
+      <w:r>
+        <w:rPr/>
+        <w:t>Overall marginal agreement; subgroup calibration and transport across waves still to be evaluated</w:t>
+      </w:r>
+    </w:p>
+    <w:p>
+      <w:pPr>
+        <w:pStyle w:val="Compact"/>
+        <w:numPr>
+          <w:ilvl w:val="1"/>
+          <w:numId w:val="1"/>
+        </w:numPr>
+        <w:rPr/>
+      </w:pPr>
+      <w:r>
+        <w:rPr/>
+        <w:t>PMM probability-allocation kappa and modal-class kappa; separate estimands (Table 3)</w:t>
+      </w:r>
+    </w:p>
+    <w:p>
+      <w:pPr>
+        <w:pStyle w:val="Compact"/>
+        <w:numPr>
+          <w:ilvl w:val="1"/>
+          <w:numId w:val="1"/>
+        </w:numPr>
         <w:spacing w:before="36" w:after="36"/>
         <w:rPr/>
       </w:pPr>
       <w:r>
         <w:rPr/>
-        <w:t>[Provenance: analysis design; inference; R/PMM_102_calibration_model.R; R/PMM_114_mci_ceiling.R]</w:t>
+        <w:t>[Provenance: analysis design; inference; Tables 2b and 3]</w:t>
       </w:r>
       <w:bookmarkEnd w:id="0"/>
       <w:bookmarkEnd w:id="12"/>
@@ -10286,6 +10454,414 @@
   </w:abstractNum>
   <w:abstractNum w:abstractNumId="54">
     <w:lvl w:ilvl="0">
+      <w:numFmt w:val="bullet"/>
+      <w:lvlText w:val=""/>
+      <w:lvlJc w:val="left"/>
+      <w:pPr>
+        <w:tabs>
+          <w:tab w:val="num" w:pos="0"/>
+        </w:tabs>
+        <w:ind w:left="720" w:hanging="360"/>
+      </w:pPr>
+      <w:rPr>
+        <w:rFonts w:ascii="Symbol" w:hAnsi="Symbol" w:cs="Symbol" w:hint="default"/>
+      </w:rPr>
+    </w:lvl>
+    <w:lvl w:ilvl="1">
+      <w:start w:val="0"/>
+      <w:numFmt w:val="bullet"/>
+      <w:lvlText w:val="o"/>
+      <w:lvlJc w:val="left"/>
+      <w:pPr>
+        <w:tabs>
+          <w:tab w:val="num" w:pos="0"/>
+        </w:tabs>
+        <w:ind w:left="1440" w:hanging="360"/>
+      </w:pPr>
+      <w:rPr>
+        <w:rFonts w:ascii="Courier New" w:hAnsi="Courier New" w:cs="Courier New" w:hint="default"/>
+      </w:rPr>
+    </w:lvl>
+    <w:lvl w:ilvl="2">
+      <w:start w:val="0"/>
+      <w:numFmt w:val="bullet"/>
+      <w:lvlText w:val=""/>
+      <w:lvlJc w:val="left"/>
+      <w:pPr>
+        <w:tabs>
+          <w:tab w:val="num" w:pos="0"/>
+        </w:tabs>
+        <w:ind w:left="2160" w:hanging="360"/>
+      </w:pPr>
+      <w:rPr>
+        <w:rFonts w:ascii="Wingdings" w:hAnsi="Wingdings" w:cs="Wingdings" w:hint="default"/>
+      </w:rPr>
+    </w:lvl>
+    <w:lvl w:ilvl="3">
+      <w:start w:val="0"/>
+      <w:numFmt w:val="bullet"/>
+      <w:lvlText w:val=""/>
+      <w:lvlJc w:val="left"/>
+      <w:pPr>
+        <w:tabs>
+          <w:tab w:val="num" w:pos="0"/>
+        </w:tabs>
+        <w:ind w:left="2880" w:hanging="360"/>
+      </w:pPr>
+      <w:rPr>
+        <w:rFonts w:ascii="Symbol" w:hAnsi="Symbol" w:cs="Symbol" w:hint="default"/>
+      </w:rPr>
+    </w:lvl>
+    <w:lvl w:ilvl="4">
+      <w:start w:val="0"/>
+      <w:numFmt w:val="bullet"/>
+      <w:lvlText w:val="o"/>
+      <w:lvlJc w:val="left"/>
+      <w:pPr>
+        <w:tabs>
+          <w:tab w:val="num" w:pos="0"/>
+        </w:tabs>
+        <w:ind w:left="3600" w:hanging="360"/>
+      </w:pPr>
+      <w:rPr>
+        <w:rFonts w:ascii="Courier New" w:hAnsi="Courier New" w:cs="Courier New" w:hint="default"/>
+      </w:rPr>
+    </w:lvl>
+    <w:lvl w:ilvl="5">
+      <w:start w:val="0"/>
+      <w:numFmt w:val="bullet"/>
+      <w:lvlText w:val=""/>
+      <w:lvlJc w:val="left"/>
+      <w:pPr>
+        <w:tabs>
+          <w:tab w:val="num" w:pos="0"/>
+        </w:tabs>
+        <w:ind w:left="4320" w:hanging="360"/>
+      </w:pPr>
+      <w:rPr>
+        <w:rFonts w:ascii="Wingdings" w:hAnsi="Wingdings" w:cs="Wingdings" w:hint="default"/>
+      </w:rPr>
+    </w:lvl>
+    <w:lvl w:ilvl="6">
+      <w:start w:val="0"/>
+      <w:numFmt w:val="bullet"/>
+      <w:lvlText w:val=""/>
+      <w:lvlJc w:val="left"/>
+      <w:pPr>
+        <w:tabs>
+          <w:tab w:val="num" w:pos="0"/>
+        </w:tabs>
+        <w:ind w:left="5040" w:hanging="360"/>
+      </w:pPr>
+      <w:rPr>
+        <w:rFonts w:ascii="Symbol" w:hAnsi="Symbol" w:cs="Symbol" w:hint="default"/>
+      </w:rPr>
+    </w:lvl>
+    <w:lvl w:ilvl="7">
+      <w:start w:val="0"/>
+      <w:numFmt w:val="bullet"/>
+      <w:lvlText w:val="o"/>
+      <w:lvlJc w:val="left"/>
+      <w:pPr>
+        <w:tabs>
+          <w:tab w:val="num" w:pos="0"/>
+        </w:tabs>
+        <w:ind w:left="5760" w:hanging="360"/>
+      </w:pPr>
+      <w:rPr>
+        <w:rFonts w:ascii="Courier New" w:hAnsi="Courier New" w:cs="Courier New" w:hint="default"/>
+      </w:rPr>
+    </w:lvl>
+    <w:lvl w:ilvl="8">
+      <w:start w:val="0"/>
+      <w:numFmt w:val="bullet"/>
+      <w:lvlText w:val=""/>
+      <w:lvlJc w:val="left"/>
+      <w:pPr>
+        <w:tabs>
+          <w:tab w:val="num" w:pos="0"/>
+        </w:tabs>
+        <w:ind w:left="6480" w:hanging="360"/>
+      </w:pPr>
+      <w:rPr>
+        <w:rFonts w:ascii="Wingdings" w:hAnsi="Wingdings" w:cs="Wingdings" w:hint="default"/>
+      </w:rPr>
+    </w:lvl>
+  </w:abstractNum>
+  <w:abstractNum w:abstractNumId="55">
+    <w:lvl w:ilvl="0">
+      <w:numFmt w:val="bullet"/>
+      <w:lvlText w:val=""/>
+      <w:lvlJc w:val="left"/>
+      <w:pPr>
+        <w:tabs>
+          <w:tab w:val="num" w:pos="0"/>
+        </w:tabs>
+        <w:ind w:left="720" w:hanging="360"/>
+      </w:pPr>
+      <w:rPr>
+        <w:rFonts w:ascii="Symbol" w:hAnsi="Symbol" w:cs="Symbol" w:hint="default"/>
+      </w:rPr>
+    </w:lvl>
+    <w:lvl w:ilvl="1">
+      <w:start w:val="0"/>
+      <w:numFmt w:val="bullet"/>
+      <w:lvlText w:val="o"/>
+      <w:lvlJc w:val="left"/>
+      <w:pPr>
+        <w:tabs>
+          <w:tab w:val="num" w:pos="0"/>
+        </w:tabs>
+        <w:ind w:left="1440" w:hanging="360"/>
+      </w:pPr>
+      <w:rPr>
+        <w:rFonts w:ascii="Courier New" w:hAnsi="Courier New" w:cs="Courier New" w:hint="default"/>
+      </w:rPr>
+    </w:lvl>
+    <w:lvl w:ilvl="2">
+      <w:start w:val="0"/>
+      <w:numFmt w:val="bullet"/>
+      <w:lvlText w:val=""/>
+      <w:lvlJc w:val="left"/>
+      <w:pPr>
+        <w:tabs>
+          <w:tab w:val="num" w:pos="0"/>
+        </w:tabs>
+        <w:ind w:left="2160" w:hanging="360"/>
+      </w:pPr>
+      <w:rPr>
+        <w:rFonts w:ascii="Wingdings" w:hAnsi="Wingdings" w:cs="Wingdings" w:hint="default"/>
+      </w:rPr>
+    </w:lvl>
+    <w:lvl w:ilvl="3">
+      <w:start w:val="0"/>
+      <w:numFmt w:val="bullet"/>
+      <w:lvlText w:val=""/>
+      <w:lvlJc w:val="left"/>
+      <w:pPr>
+        <w:tabs>
+          <w:tab w:val="num" w:pos="0"/>
+        </w:tabs>
+        <w:ind w:left="2880" w:hanging="360"/>
+      </w:pPr>
+      <w:rPr>
+        <w:rFonts w:ascii="Symbol" w:hAnsi="Symbol" w:cs="Symbol" w:hint="default"/>
+      </w:rPr>
+    </w:lvl>
+    <w:lvl w:ilvl="4">
+      <w:start w:val="0"/>
+      <w:numFmt w:val="bullet"/>
+      <w:lvlText w:val="o"/>
+      <w:lvlJc w:val="left"/>
+      <w:pPr>
+        <w:tabs>
+          <w:tab w:val="num" w:pos="0"/>
+        </w:tabs>
+        <w:ind w:left="3600" w:hanging="360"/>
+      </w:pPr>
+      <w:rPr>
+        <w:rFonts w:ascii="Courier New" w:hAnsi="Courier New" w:cs="Courier New" w:hint="default"/>
+      </w:rPr>
+    </w:lvl>
+    <w:lvl w:ilvl="5">
+      <w:start w:val="0"/>
+      <w:numFmt w:val="bullet"/>
+      <w:lvlText w:val=""/>
+      <w:lvlJc w:val="left"/>
+      <w:pPr>
+        <w:tabs>
+          <w:tab w:val="num" w:pos="0"/>
+        </w:tabs>
+        <w:ind w:left="4320" w:hanging="360"/>
+      </w:pPr>
+      <w:rPr>
+        <w:rFonts w:ascii="Wingdings" w:hAnsi="Wingdings" w:cs="Wingdings" w:hint="default"/>
+      </w:rPr>
+    </w:lvl>
+    <w:lvl w:ilvl="6">
+      <w:start w:val="0"/>
+      <w:numFmt w:val="bullet"/>
+      <w:lvlText w:val=""/>
+      <w:lvlJc w:val="left"/>
+      <w:pPr>
+        <w:tabs>
+          <w:tab w:val="num" w:pos="0"/>
+        </w:tabs>
+        <w:ind w:left="5040" w:hanging="360"/>
+      </w:pPr>
+      <w:rPr>
+        <w:rFonts w:ascii="Symbol" w:hAnsi="Symbol" w:cs="Symbol" w:hint="default"/>
+      </w:rPr>
+    </w:lvl>
+    <w:lvl w:ilvl="7">
+      <w:start w:val="0"/>
+      <w:numFmt w:val="bullet"/>
+      <w:lvlText w:val="o"/>
+      <w:lvlJc w:val="left"/>
+      <w:pPr>
+        <w:tabs>
+          <w:tab w:val="num" w:pos="0"/>
+        </w:tabs>
+        <w:ind w:left="5760" w:hanging="360"/>
+      </w:pPr>
+      <w:rPr>
+        <w:rFonts w:ascii="Courier New" w:hAnsi="Courier New" w:cs="Courier New" w:hint="default"/>
+      </w:rPr>
+    </w:lvl>
+    <w:lvl w:ilvl="8">
+      <w:start w:val="0"/>
+      <w:numFmt w:val="bullet"/>
+      <w:lvlText w:val=""/>
+      <w:lvlJc w:val="left"/>
+      <w:pPr>
+        <w:tabs>
+          <w:tab w:val="num" w:pos="0"/>
+        </w:tabs>
+        <w:ind w:left="6480" w:hanging="360"/>
+      </w:pPr>
+      <w:rPr>
+        <w:rFonts w:ascii="Wingdings" w:hAnsi="Wingdings" w:cs="Wingdings" w:hint="default"/>
+      </w:rPr>
+    </w:lvl>
+  </w:abstractNum>
+  <w:abstractNum w:abstractNumId="56">
+    <w:lvl w:ilvl="0">
+      <w:numFmt w:val="bullet"/>
+      <w:lvlText w:val=""/>
+      <w:lvlJc w:val="left"/>
+      <w:pPr>
+        <w:tabs>
+          <w:tab w:val="num" w:pos="0"/>
+        </w:tabs>
+        <w:ind w:left="720" w:hanging="360"/>
+      </w:pPr>
+      <w:rPr>
+        <w:rFonts w:ascii="Symbol" w:hAnsi="Symbol" w:cs="Symbol" w:hint="default"/>
+      </w:rPr>
+    </w:lvl>
+    <w:lvl w:ilvl="1">
+      <w:start w:val="0"/>
+      <w:numFmt w:val="bullet"/>
+      <w:lvlText w:val="o"/>
+      <w:lvlJc w:val="left"/>
+      <w:pPr>
+        <w:tabs>
+          <w:tab w:val="num" w:pos="0"/>
+        </w:tabs>
+        <w:ind w:left="1440" w:hanging="360"/>
+      </w:pPr>
+      <w:rPr>
+        <w:rFonts w:ascii="Courier New" w:hAnsi="Courier New" w:cs="Courier New" w:hint="default"/>
+      </w:rPr>
+    </w:lvl>
+    <w:lvl w:ilvl="2">
+      <w:start w:val="0"/>
+      <w:numFmt w:val="bullet"/>
+      <w:lvlText w:val=""/>
+      <w:lvlJc w:val="left"/>
+      <w:pPr>
+        <w:tabs>
+          <w:tab w:val="num" w:pos="0"/>
+        </w:tabs>
+        <w:ind w:left="2160" w:hanging="360"/>
+      </w:pPr>
+      <w:rPr>
+        <w:rFonts w:ascii="Wingdings" w:hAnsi="Wingdings" w:cs="Wingdings" w:hint="default"/>
+      </w:rPr>
+    </w:lvl>
+    <w:lvl w:ilvl="3">
+      <w:start w:val="0"/>
+      <w:numFmt w:val="bullet"/>
+      <w:lvlText w:val=""/>
+      <w:lvlJc w:val="left"/>
+      <w:pPr>
+        <w:tabs>
+          <w:tab w:val="num" w:pos="0"/>
+        </w:tabs>
+        <w:ind w:left="2880" w:hanging="360"/>
+      </w:pPr>
+      <w:rPr>
+        <w:rFonts w:ascii="Symbol" w:hAnsi="Symbol" w:cs="Symbol" w:hint="default"/>
+      </w:rPr>
+    </w:lvl>
+    <w:lvl w:ilvl="4">
+      <w:start w:val="0"/>
+      <w:numFmt w:val="bullet"/>
+      <w:lvlText w:val="o"/>
+      <w:lvlJc w:val="left"/>
+      <w:pPr>
+        <w:tabs>
+          <w:tab w:val="num" w:pos="0"/>
+        </w:tabs>
+        <w:ind w:left="3600" w:hanging="360"/>
+      </w:pPr>
+      <w:rPr>
+        <w:rFonts w:ascii="Courier New" w:hAnsi="Courier New" w:cs="Courier New" w:hint="default"/>
+      </w:rPr>
+    </w:lvl>
+    <w:lvl w:ilvl="5">
+      <w:start w:val="0"/>
+      <w:numFmt w:val="bullet"/>
+      <w:lvlText w:val=""/>
+      <w:lvlJc w:val="left"/>
+      <w:pPr>
+        <w:tabs>
+          <w:tab w:val="num" w:pos="0"/>
+        </w:tabs>
+        <w:ind w:left="4320" w:hanging="360"/>
+      </w:pPr>
+      <w:rPr>
+        <w:rFonts w:ascii="Wingdings" w:hAnsi="Wingdings" w:cs="Wingdings" w:hint="default"/>
+      </w:rPr>
+    </w:lvl>
+    <w:lvl w:ilvl="6">
+      <w:start w:val="0"/>
+      <w:numFmt w:val="bullet"/>
+      <w:lvlText w:val=""/>
+      <w:lvlJc w:val="left"/>
+      <w:pPr>
+        <w:tabs>
+          <w:tab w:val="num" w:pos="0"/>
+        </w:tabs>
+        <w:ind w:left="5040" w:hanging="360"/>
+      </w:pPr>
+      <w:rPr>
+        <w:rFonts w:ascii="Symbol" w:hAnsi="Symbol" w:cs="Symbol" w:hint="default"/>
+      </w:rPr>
+    </w:lvl>
+    <w:lvl w:ilvl="7">
+      <w:start w:val="0"/>
+      <w:numFmt w:val="bullet"/>
+      <w:lvlText w:val="o"/>
+      <w:lvlJc w:val="left"/>
+      <w:pPr>
+        <w:tabs>
+          <w:tab w:val="num" w:pos="0"/>
+        </w:tabs>
+        <w:ind w:left="5760" w:hanging="360"/>
+      </w:pPr>
+      <w:rPr>
+        <w:rFonts w:ascii="Courier New" w:hAnsi="Courier New" w:cs="Courier New" w:hint="default"/>
+      </w:rPr>
+    </w:lvl>
+    <w:lvl w:ilvl="8">
+      <w:start w:val="0"/>
+      <w:numFmt w:val="bullet"/>
+      <w:lvlText w:val=""/>
+      <w:lvlJc w:val="left"/>
+      <w:pPr>
+        <w:tabs>
+          <w:tab w:val="num" w:pos="0"/>
+        </w:tabs>
+        <w:ind w:left="6480" w:hanging="360"/>
+      </w:pPr>
+      <w:rPr>
+        <w:rFonts w:ascii="Wingdings" w:hAnsi="Wingdings" w:cs="Wingdings" w:hint="default"/>
+      </w:rPr>
+    </w:lvl>
+  </w:abstractNum>
+  <w:abstractNum w:abstractNumId="57">
+    <w:lvl w:ilvl="0">
       <w:start w:val="1"/>
       <w:numFmt w:val="none"/>
       <w:suff w:val="nothing"/>
@@ -10564,6 +11140,15 @@
   </w:num>
   <w:num w:numId="54">
     <w:abstractNumId w:val="54"/>
+  </w:num>
+  <w:num w:numId="55">
+    <w:abstractNumId w:val="55"/>
+  </w:num>
+  <w:num w:numId="56">
+    <w:abstractNumId w:val="56"/>
+  </w:num>
+  <w:num w:numId="57">
+    <w:abstractNumId w:val="57"/>
   </w:num>
 </w:numbering>
 </file>

</xml_diff>